<commit_message>
Changed to mime decoder
</commit_message>
<xml_diff>
--- a/API Calls.docx
+++ b/API Calls.docx
@@ -10,11 +10,11 @@
         <w:tblLook w:val="04A0" w:firstRow="1" w:lastRow="0" w:firstColumn="1" w:lastColumn="0" w:noHBand="0" w:noVBand="1"/>
       </w:tblPr>
       <w:tblGrid>
-        <w:gridCol w:w="1422"/>
-        <w:gridCol w:w="1090"/>
-        <w:gridCol w:w="4069"/>
-        <w:gridCol w:w="1313"/>
-        <w:gridCol w:w="1127"/>
+        <w:gridCol w:w="1406"/>
+        <w:gridCol w:w="1080"/>
+        <w:gridCol w:w="4023"/>
+        <w:gridCol w:w="1396"/>
+        <w:gridCol w:w="1116"/>
       </w:tblGrid>
       <w:tr>
         <w:tc>
@@ -551,7 +551,7 @@
                 <w:sz w:val="22"/>
                 <w:szCs w:val="22"/>
               </w:rPr>
-              <w:t>Admin Controller</w:t>
+              <w:t>Authentication Controller</w:t>
             </w:r>
           </w:p>
         </w:tc>
@@ -571,7 +571,7 @@
                 <w:sz w:val="22"/>
                 <w:szCs w:val="22"/>
               </w:rPr>
-              <w:t>Get list of all the users</w:t>
+              <w:t>Get all services</w:t>
             </w:r>
           </w:p>
         </w:tc>
@@ -591,8 +591,30 @@
                 <w:sz w:val="22"/>
                 <w:szCs w:val="22"/>
               </w:rPr>
-              <w:t>GET: /api/admin/get-users</w:t>
-            </w:r>
+              <w:t>GET: /api/</w:t>
+            </w:r>
+            <w:r>
+              <w:rPr>
+                <w:sz w:val="22"/>
+                <w:szCs w:val="22"/>
+              </w:rPr>
+              <w:t>auth/</w:t>
+            </w:r>
+            <w:r>
+              <w:rPr>
+                <w:sz w:val="22"/>
+                <w:szCs w:val="22"/>
+              </w:rPr>
+              <w:t>get-all-services</w:t>
+            </w:r>
+          </w:p>
+          <w:p>
+            <w:pPr>
+              <w:rPr>
+                <w:sz w:val="22"/>
+                <w:szCs w:val="22"/>
+              </w:rPr>
+            </w:pPr>
           </w:p>
         </w:tc>
         <w:tc>
@@ -611,7 +633,67 @@
                 <w:sz w:val="22"/>
                 <w:szCs w:val="22"/>
               </w:rPr>
-              <w:t>Get a list of all the users.</w:t>
+              <w:t>Returns list of services {</w:t>
+            </w:r>
+          </w:p>
+          <w:p>
+            <w:pPr>
+              <w:rPr>
+                <w:sz w:val="22"/>
+                <w:szCs w:val="22"/>
+              </w:rPr>
+            </w:pPr>
+            <w:r>
+              <w:rPr>
+                <w:sz w:val="22"/>
+                <w:szCs w:val="22"/>
+              </w:rPr>
+              <w:t>serviced,</w:t>
+            </w:r>
+          </w:p>
+          <w:p>
+            <w:pPr>
+              <w:rPr>
+                <w:sz w:val="22"/>
+                <w:szCs w:val="22"/>
+              </w:rPr>
+            </w:pPr>
+            <w:r>
+              <w:rPr>
+                <w:sz w:val="22"/>
+                <w:szCs w:val="22"/>
+              </w:rPr>
+              <w:t>serviceName,</w:t>
+            </w:r>
+          </w:p>
+          <w:p>
+            <w:pPr>
+              <w:rPr>
+                <w:sz w:val="22"/>
+                <w:szCs w:val="22"/>
+              </w:rPr>
+            </w:pPr>
+            <w:r>
+              <w:rPr>
+                <w:sz w:val="22"/>
+                <w:szCs w:val="22"/>
+              </w:rPr>
+              <w:t>NoOfProviders</w:t>
+            </w:r>
+          </w:p>
+          <w:p>
+            <w:pPr>
+              <w:rPr>
+                <w:sz w:val="22"/>
+                <w:szCs w:val="22"/>
+              </w:rPr>
+            </w:pPr>
+            <w:r>
+              <w:rPr>
+                <w:sz w:val="22"/>
+                <w:szCs w:val="22"/>
+              </w:rPr>
+              <w:t>}</w:t>
             </w:r>
           </w:p>
         </w:tc>
@@ -631,7 +713,7 @@
                 <w:sz w:val="22"/>
                 <w:szCs w:val="22"/>
               </w:rPr>
-              <w:t>Admin</w:t>
+              <w:t>Everyone</w:t>
             </w:r>
           </w:p>
         </w:tc>
@@ -673,7 +755,7 @@
                 <w:sz w:val="22"/>
                 <w:szCs w:val="22"/>
               </w:rPr>
-              <w:t>Get list of all the customers</w:t>
+              <w:t>Get list of all the users</w:t>
             </w:r>
           </w:p>
         </w:tc>
@@ -693,7 +775,7 @@
                 <w:sz w:val="22"/>
                 <w:szCs w:val="22"/>
               </w:rPr>
-              <w:t>GET: /api/admin/get-customers</w:t>
+              <w:t>GET: /api/admin/get-users</w:t>
             </w:r>
           </w:p>
         </w:tc>
@@ -713,7 +795,7 @@
                 <w:sz w:val="22"/>
                 <w:szCs w:val="22"/>
               </w:rPr>
-              <w:t>Get a list of all the registered customers.</w:t>
+              <w:t>Get a list of all the users.</w:t>
             </w:r>
           </w:p>
         </w:tc>
@@ -775,7 +857,7 @@
                 <w:sz w:val="22"/>
                 <w:szCs w:val="22"/>
               </w:rPr>
-              <w:t>Get a particular customer</w:t>
+              <w:t>Get list of all the customers</w:t>
             </w:r>
           </w:p>
         </w:tc>
@@ -795,7 +877,7 @@
                 <w:sz w:val="22"/>
                 <w:szCs w:val="22"/>
               </w:rPr>
-              <w:t>GET: /api/admin/get-customers/{customerId}</w:t>
+              <w:t>GET: /api/admin/get-customers</w:t>
             </w:r>
           </w:p>
         </w:tc>
@@ -815,7 +897,7 @@
                 <w:sz w:val="22"/>
                 <w:szCs w:val="22"/>
               </w:rPr>
-              <w:t>Get a specific customer by providing their customer id.</w:t>
+              <w:t>Get a list of all the registered customers.</w:t>
             </w:r>
           </w:p>
         </w:tc>
@@ -877,7 +959,7 @@
                 <w:sz w:val="22"/>
                 <w:szCs w:val="22"/>
               </w:rPr>
-              <w:t>Create a customer</w:t>
+              <w:t>Get a particular customer</w:t>
             </w:r>
           </w:p>
         </w:tc>
@@ -897,37 +979,8 @@
                 <w:sz w:val="22"/>
                 <w:szCs w:val="22"/>
               </w:rPr>
-              <w:t xml:space="preserve">POST: </w:t>
-            </w:r>
-            <w:r>
-              <w:rPr>
-                <w:sz w:val="22"/>
-                <w:szCs w:val="22"/>
-              </w:rPr>
-              <w:t>/api/admin</w:t>
-            </w:r>
-            <w:r>
-              <w:rPr>
-                <w:sz w:val="22"/>
-                <w:szCs w:val="22"/>
-              </w:rPr>
-              <w:t>/</w:t>
-            </w:r>
-            <w:r>
-              <w:rPr>
-                <w:sz w:val="22"/>
-                <w:szCs w:val="22"/>
-              </w:rPr>
-              <w:t>create-customer</w:t>
-            </w:r>
-          </w:p>
-          <w:p>
-            <w:pPr>
-              <w:rPr>
-                <w:sz w:val="22"/>
-                <w:szCs w:val="22"/>
-              </w:rPr>
-            </w:pPr>
+              <w:t>GET: /api/admin/get-customers/{customerId}</w:t>
+            </w:r>
           </w:p>
         </w:tc>
         <w:tc>
@@ -946,7 +999,7 @@
                 <w:sz w:val="22"/>
                 <w:szCs w:val="22"/>
               </w:rPr>
-              <w:t>Create a customer through Admin</w:t>
+              <w:t>Get a specific customer by providing their customer id.</w:t>
             </w:r>
           </w:p>
         </w:tc>
@@ -1008,7 +1061,7 @@
                 <w:sz w:val="22"/>
                 <w:szCs w:val="22"/>
               </w:rPr>
-              <w:t xml:space="preserve">Update a customer </w:t>
+              <w:t>Create a customer</w:t>
             </w:r>
           </w:p>
         </w:tc>
@@ -1028,8 +1081,37 @@
                 <w:sz w:val="22"/>
                 <w:szCs w:val="22"/>
               </w:rPr>
-              <w:t>PUT: /api/admin/update-customer</w:t>
-            </w:r>
+              <w:t xml:space="preserve">POST: </w:t>
+            </w:r>
+            <w:r>
+              <w:rPr>
+                <w:sz w:val="22"/>
+                <w:szCs w:val="22"/>
+              </w:rPr>
+              <w:t>/api/admin</w:t>
+            </w:r>
+            <w:r>
+              <w:rPr>
+                <w:sz w:val="22"/>
+                <w:szCs w:val="22"/>
+              </w:rPr>
+              <w:t>/</w:t>
+            </w:r>
+            <w:r>
+              <w:rPr>
+                <w:sz w:val="22"/>
+                <w:szCs w:val="22"/>
+              </w:rPr>
+              <w:t>create-customer</w:t>
+            </w:r>
+          </w:p>
+          <w:p>
+            <w:pPr>
+              <w:rPr>
+                <w:sz w:val="22"/>
+                <w:szCs w:val="22"/>
+              </w:rPr>
+            </w:pPr>
           </w:p>
         </w:tc>
         <w:tc>
@@ -1048,7 +1130,7 @@
                 <w:sz w:val="22"/>
                 <w:szCs w:val="22"/>
               </w:rPr>
-              <w:t>Update details of a particular customer.</w:t>
+              <w:t>Create a customer through Admin</w:t>
             </w:r>
           </w:p>
         </w:tc>
@@ -1090,6 +1172,7 @@
                 <w:sz w:val="22"/>
                 <w:szCs w:val="22"/>
               </w:rPr>
+              <w:lastRenderedPageBreak/>
               <w:t>Admin Controller</w:t>
             </w:r>
           </w:p>
@@ -1110,6 +1193,108 @@
                 <w:sz w:val="22"/>
                 <w:szCs w:val="22"/>
               </w:rPr>
+              <w:t xml:space="preserve">Update a customer </w:t>
+            </w:r>
+          </w:p>
+        </w:tc>
+        <w:tc>
+          <w:tcPr>
+            <w:tcW w:w="4069" w:type="dxa"/>
+          </w:tcPr>
+          <w:p>
+            <w:pPr>
+              <w:rPr>
+                <w:sz w:val="22"/>
+                <w:szCs w:val="22"/>
+              </w:rPr>
+            </w:pPr>
+            <w:r>
+              <w:rPr>
+                <w:sz w:val="22"/>
+                <w:szCs w:val="22"/>
+              </w:rPr>
+              <w:t>PUT: /api/admin/update-customer</w:t>
+            </w:r>
+          </w:p>
+        </w:tc>
+        <w:tc>
+          <w:tcPr>
+            <w:tcW w:w="1313" w:type="dxa"/>
+          </w:tcPr>
+          <w:p>
+            <w:pPr>
+              <w:rPr>
+                <w:sz w:val="22"/>
+                <w:szCs w:val="22"/>
+              </w:rPr>
+            </w:pPr>
+            <w:r>
+              <w:rPr>
+                <w:sz w:val="22"/>
+                <w:szCs w:val="22"/>
+              </w:rPr>
+              <w:t>Update details of a particular customer.</w:t>
+            </w:r>
+          </w:p>
+        </w:tc>
+        <w:tc>
+          <w:tcPr>
+            <w:tcW w:w="1127" w:type="dxa"/>
+          </w:tcPr>
+          <w:p>
+            <w:pPr>
+              <w:rPr>
+                <w:sz w:val="22"/>
+                <w:szCs w:val="22"/>
+              </w:rPr>
+            </w:pPr>
+            <w:r>
+              <w:rPr>
+                <w:sz w:val="22"/>
+                <w:szCs w:val="22"/>
+              </w:rPr>
+              <w:t>Admin</w:t>
+            </w:r>
+          </w:p>
+        </w:tc>
+      </w:tr>
+      <w:tr>
+        <w:tc>
+          <w:tcPr>
+            <w:tcW w:w="1422" w:type="dxa"/>
+          </w:tcPr>
+          <w:p>
+            <w:pPr>
+              <w:rPr>
+                <w:sz w:val="22"/>
+                <w:szCs w:val="22"/>
+              </w:rPr>
+            </w:pPr>
+            <w:r>
+              <w:rPr>
+                <w:sz w:val="22"/>
+                <w:szCs w:val="22"/>
+              </w:rPr>
+              <w:t>Admin Controller</w:t>
+            </w:r>
+          </w:p>
+        </w:tc>
+        <w:tc>
+          <w:tcPr>
+            <w:tcW w:w="1090" w:type="dxa"/>
+          </w:tcPr>
+          <w:p>
+            <w:pPr>
+              <w:rPr>
+                <w:sz w:val="22"/>
+                <w:szCs w:val="22"/>
+              </w:rPr>
+            </w:pPr>
+            <w:r>
+              <w:rPr>
+                <w:sz w:val="22"/>
+                <w:szCs w:val="22"/>
+              </w:rPr>
               <w:t>Delete a customer</w:t>
             </w:r>
           </w:p>
@@ -1150,7 +1335,742 @@
                 <w:sz w:val="22"/>
                 <w:szCs w:val="22"/>
               </w:rPr>
-              <w:t xml:space="preserve">Delete a particular customer </w:t>
+              <w:t>Delete a particular customer by providing their customer id.</w:t>
+            </w:r>
+          </w:p>
+        </w:tc>
+        <w:tc>
+          <w:tcPr>
+            <w:tcW w:w="1127" w:type="dxa"/>
+          </w:tcPr>
+          <w:p>
+            <w:pPr>
+              <w:rPr>
+                <w:sz w:val="22"/>
+                <w:szCs w:val="22"/>
+              </w:rPr>
+            </w:pPr>
+            <w:r>
+              <w:rPr>
+                <w:sz w:val="22"/>
+                <w:szCs w:val="22"/>
+              </w:rPr>
+              <w:t>Admin</w:t>
+            </w:r>
+          </w:p>
+        </w:tc>
+      </w:tr>
+      <w:tr>
+        <w:tc>
+          <w:tcPr>
+            <w:tcW w:w="1422" w:type="dxa"/>
+          </w:tcPr>
+          <w:p>
+            <w:pPr>
+              <w:rPr>
+                <w:sz w:val="22"/>
+                <w:szCs w:val="22"/>
+              </w:rPr>
+            </w:pPr>
+            <w:r>
+              <w:rPr>
+                <w:sz w:val="22"/>
+                <w:szCs w:val="22"/>
+              </w:rPr>
+              <w:t>Admin Customer</w:t>
+            </w:r>
+          </w:p>
+        </w:tc>
+        <w:tc>
+          <w:tcPr>
+            <w:tcW w:w="1090" w:type="dxa"/>
+          </w:tcPr>
+          <w:p>
+            <w:pPr>
+              <w:rPr>
+                <w:sz w:val="22"/>
+                <w:szCs w:val="22"/>
+              </w:rPr>
+            </w:pPr>
+            <w:r>
+              <w:rPr>
+                <w:sz w:val="22"/>
+                <w:szCs w:val="22"/>
+              </w:rPr>
+              <w:t>Get a list of all the providers</w:t>
+            </w:r>
+          </w:p>
+        </w:tc>
+        <w:tc>
+          <w:tcPr>
+            <w:tcW w:w="4069" w:type="dxa"/>
+          </w:tcPr>
+          <w:p>
+            <w:pPr>
+              <w:rPr>
+                <w:sz w:val="22"/>
+                <w:szCs w:val="22"/>
+              </w:rPr>
+            </w:pPr>
+            <w:r>
+              <w:rPr>
+                <w:sz w:val="22"/>
+                <w:szCs w:val="22"/>
+              </w:rPr>
+              <w:t>GET: /api/admin/get-providers</w:t>
+            </w:r>
+          </w:p>
+        </w:tc>
+        <w:tc>
+          <w:tcPr>
+            <w:tcW w:w="1313" w:type="dxa"/>
+          </w:tcPr>
+          <w:p>
+            <w:pPr>
+              <w:rPr>
+                <w:sz w:val="22"/>
+                <w:szCs w:val="22"/>
+              </w:rPr>
+            </w:pPr>
+            <w:r>
+              <w:rPr>
+                <w:sz w:val="22"/>
+                <w:szCs w:val="22"/>
+              </w:rPr>
+              <w:t>Get a list of all the registered providers.</w:t>
+            </w:r>
+          </w:p>
+        </w:tc>
+        <w:tc>
+          <w:tcPr>
+            <w:tcW w:w="1127" w:type="dxa"/>
+          </w:tcPr>
+          <w:p>
+            <w:pPr>
+              <w:rPr>
+                <w:sz w:val="22"/>
+                <w:szCs w:val="22"/>
+              </w:rPr>
+            </w:pPr>
+            <w:r>
+              <w:rPr>
+                <w:sz w:val="22"/>
+                <w:szCs w:val="22"/>
+              </w:rPr>
+              <w:t>Admin</w:t>
+            </w:r>
+          </w:p>
+        </w:tc>
+      </w:tr>
+      <w:tr>
+        <w:tc>
+          <w:tcPr>
+            <w:tcW w:w="1422" w:type="dxa"/>
+          </w:tcPr>
+          <w:p>
+            <w:pPr>
+              <w:rPr>
+                <w:sz w:val="22"/>
+                <w:szCs w:val="22"/>
+              </w:rPr>
+            </w:pPr>
+            <w:r>
+              <w:rPr>
+                <w:sz w:val="22"/>
+                <w:szCs w:val="22"/>
+              </w:rPr>
+              <w:t>Admin Controller</w:t>
+            </w:r>
+          </w:p>
+        </w:tc>
+        <w:tc>
+          <w:tcPr>
+            <w:tcW w:w="1090" w:type="dxa"/>
+          </w:tcPr>
+          <w:p>
+            <w:pPr>
+              <w:rPr>
+                <w:sz w:val="22"/>
+                <w:szCs w:val="22"/>
+              </w:rPr>
+            </w:pPr>
+            <w:r>
+              <w:rPr>
+                <w:sz w:val="22"/>
+                <w:szCs w:val="22"/>
+              </w:rPr>
+              <w:t>Get a specific provider</w:t>
+            </w:r>
+          </w:p>
+        </w:tc>
+        <w:tc>
+          <w:tcPr>
+            <w:tcW w:w="4069" w:type="dxa"/>
+          </w:tcPr>
+          <w:p>
+            <w:pPr>
+              <w:rPr>
+                <w:sz w:val="22"/>
+                <w:szCs w:val="22"/>
+              </w:rPr>
+            </w:pPr>
+            <w:r>
+              <w:rPr>
+                <w:sz w:val="22"/>
+                <w:szCs w:val="22"/>
+              </w:rPr>
+              <w:t>GET: /api/admin/get-providers/{providerId}</w:t>
+            </w:r>
+          </w:p>
+        </w:tc>
+        <w:tc>
+          <w:tcPr>
+            <w:tcW w:w="1313" w:type="dxa"/>
+          </w:tcPr>
+          <w:p>
+            <w:pPr>
+              <w:rPr>
+                <w:sz w:val="22"/>
+                <w:szCs w:val="22"/>
+              </w:rPr>
+            </w:pPr>
+            <w:r>
+              <w:rPr>
+                <w:sz w:val="22"/>
+                <w:szCs w:val="22"/>
+              </w:rPr>
+              <w:t>Get a specific provider by their provider id.</w:t>
+            </w:r>
+          </w:p>
+        </w:tc>
+        <w:tc>
+          <w:tcPr>
+            <w:tcW w:w="1127" w:type="dxa"/>
+          </w:tcPr>
+          <w:p>
+            <w:pPr>
+              <w:rPr>
+                <w:sz w:val="22"/>
+                <w:szCs w:val="22"/>
+              </w:rPr>
+            </w:pPr>
+            <w:r>
+              <w:rPr>
+                <w:sz w:val="22"/>
+                <w:szCs w:val="22"/>
+              </w:rPr>
+              <w:t>Admin</w:t>
+            </w:r>
+          </w:p>
+        </w:tc>
+      </w:tr>
+      <w:tr>
+        <w:tc>
+          <w:tcPr>
+            <w:tcW w:w="1422" w:type="dxa"/>
+          </w:tcPr>
+          <w:p>
+            <w:pPr>
+              <w:rPr>
+                <w:sz w:val="22"/>
+                <w:szCs w:val="22"/>
+              </w:rPr>
+            </w:pPr>
+            <w:r>
+              <w:rPr>
+                <w:sz w:val="22"/>
+                <w:szCs w:val="22"/>
+              </w:rPr>
+              <w:t>Admin Controller</w:t>
+            </w:r>
+          </w:p>
+        </w:tc>
+        <w:tc>
+          <w:tcPr>
+            <w:tcW w:w="1090" w:type="dxa"/>
+          </w:tcPr>
+          <w:p>
+            <w:pPr>
+              <w:rPr>
+                <w:sz w:val="22"/>
+                <w:szCs w:val="22"/>
+              </w:rPr>
+            </w:pPr>
+            <w:r>
+              <w:rPr>
+                <w:sz w:val="22"/>
+                <w:szCs w:val="22"/>
+              </w:rPr>
+              <w:t>Create a provider</w:t>
+            </w:r>
+          </w:p>
+        </w:tc>
+        <w:tc>
+          <w:tcPr>
+            <w:tcW w:w="4069" w:type="dxa"/>
+          </w:tcPr>
+          <w:p>
+            <w:pPr>
+              <w:rPr>
+                <w:sz w:val="22"/>
+                <w:szCs w:val="22"/>
+              </w:rPr>
+            </w:pPr>
+            <w:r>
+              <w:rPr>
+                <w:sz w:val="22"/>
+                <w:szCs w:val="22"/>
+              </w:rPr>
+              <w:t xml:space="preserve">POST: </w:t>
+            </w:r>
+            <w:r>
+              <w:rPr>
+                <w:sz w:val="22"/>
+                <w:szCs w:val="22"/>
+              </w:rPr>
+              <w:t>/api/admin</w:t>
+            </w:r>
+            <w:r>
+              <w:rPr>
+                <w:sz w:val="22"/>
+                <w:szCs w:val="22"/>
+              </w:rPr>
+              <w:t>/</w:t>
+            </w:r>
+            <w:r>
+              <w:rPr>
+                <w:sz w:val="22"/>
+                <w:szCs w:val="22"/>
+              </w:rPr>
+              <w:t>create-provider</w:t>
+            </w:r>
+          </w:p>
+        </w:tc>
+        <w:tc>
+          <w:tcPr>
+            <w:tcW w:w="1313" w:type="dxa"/>
+          </w:tcPr>
+          <w:p>
+            <w:pPr>
+              <w:rPr>
+                <w:sz w:val="22"/>
+                <w:szCs w:val="22"/>
+              </w:rPr>
+            </w:pPr>
+            <w:r>
+              <w:rPr>
+                <w:sz w:val="22"/>
+                <w:szCs w:val="22"/>
+              </w:rPr>
+              <w:t>Create a provider through Admin</w:t>
+            </w:r>
+          </w:p>
+        </w:tc>
+        <w:tc>
+          <w:tcPr>
+            <w:tcW w:w="1127" w:type="dxa"/>
+          </w:tcPr>
+          <w:p>
+            <w:pPr>
+              <w:rPr>
+                <w:sz w:val="22"/>
+                <w:szCs w:val="22"/>
+              </w:rPr>
+            </w:pPr>
+            <w:r>
+              <w:rPr>
+                <w:sz w:val="22"/>
+                <w:szCs w:val="22"/>
+              </w:rPr>
+              <w:t>Admin</w:t>
+            </w:r>
+          </w:p>
+        </w:tc>
+      </w:tr>
+      <w:tr>
+        <w:tc>
+          <w:tcPr>
+            <w:tcW w:w="1422" w:type="dxa"/>
+          </w:tcPr>
+          <w:p>
+            <w:pPr>
+              <w:rPr>
+                <w:sz w:val="22"/>
+                <w:szCs w:val="22"/>
+              </w:rPr>
+            </w:pPr>
+            <w:r>
+              <w:rPr>
+                <w:sz w:val="22"/>
+                <w:szCs w:val="22"/>
+              </w:rPr>
+              <w:t>Admin Controller</w:t>
+            </w:r>
+          </w:p>
+        </w:tc>
+        <w:tc>
+          <w:tcPr>
+            <w:tcW w:w="1090" w:type="dxa"/>
+          </w:tcPr>
+          <w:p>
+            <w:pPr>
+              <w:rPr>
+                <w:sz w:val="22"/>
+                <w:szCs w:val="22"/>
+              </w:rPr>
+            </w:pPr>
+            <w:r>
+              <w:rPr>
+                <w:sz w:val="22"/>
+                <w:szCs w:val="22"/>
+              </w:rPr>
+              <w:t>Update a provider</w:t>
+            </w:r>
+          </w:p>
+        </w:tc>
+        <w:tc>
+          <w:tcPr>
+            <w:tcW w:w="4069" w:type="dxa"/>
+          </w:tcPr>
+          <w:p>
+            <w:pPr>
+              <w:rPr>
+                <w:sz w:val="22"/>
+                <w:szCs w:val="22"/>
+              </w:rPr>
+            </w:pPr>
+            <w:r>
+              <w:rPr>
+                <w:sz w:val="22"/>
+                <w:szCs w:val="22"/>
+              </w:rPr>
+              <w:t>PUT: /api/admin/update-provider</w:t>
+            </w:r>
+          </w:p>
+        </w:tc>
+        <w:tc>
+          <w:tcPr>
+            <w:tcW w:w="1313" w:type="dxa"/>
+          </w:tcPr>
+          <w:p>
+            <w:pPr>
+              <w:rPr>
+                <w:sz w:val="22"/>
+                <w:szCs w:val="22"/>
+              </w:rPr>
+            </w:pPr>
+            <w:r>
+              <w:rPr>
+                <w:sz w:val="22"/>
+                <w:szCs w:val="22"/>
+              </w:rPr>
+              <w:t>Update details of a particular provider.</w:t>
+            </w:r>
+          </w:p>
+        </w:tc>
+        <w:tc>
+          <w:tcPr>
+            <w:tcW w:w="1127" w:type="dxa"/>
+          </w:tcPr>
+          <w:p>
+            <w:pPr>
+              <w:rPr>
+                <w:sz w:val="22"/>
+                <w:szCs w:val="22"/>
+              </w:rPr>
+            </w:pPr>
+            <w:r>
+              <w:rPr>
+                <w:sz w:val="22"/>
+                <w:szCs w:val="22"/>
+              </w:rPr>
+              <w:t>Admin</w:t>
+            </w:r>
+          </w:p>
+        </w:tc>
+      </w:tr>
+      <w:tr>
+        <w:tc>
+          <w:tcPr>
+            <w:tcW w:w="1422" w:type="dxa"/>
+          </w:tcPr>
+          <w:p>
+            <w:pPr>
+              <w:rPr>
+                <w:sz w:val="22"/>
+                <w:szCs w:val="22"/>
+              </w:rPr>
+            </w:pPr>
+            <w:r>
+              <w:rPr>
+                <w:sz w:val="22"/>
+                <w:szCs w:val="22"/>
+              </w:rPr>
+              <w:t>Admin Controller</w:t>
+            </w:r>
+          </w:p>
+        </w:tc>
+        <w:tc>
+          <w:tcPr>
+            <w:tcW w:w="1090" w:type="dxa"/>
+          </w:tcPr>
+          <w:p>
+            <w:pPr>
+              <w:rPr>
+                <w:sz w:val="22"/>
+                <w:szCs w:val="22"/>
+              </w:rPr>
+            </w:pPr>
+            <w:r>
+              <w:rPr>
+                <w:sz w:val="22"/>
+                <w:szCs w:val="22"/>
+              </w:rPr>
+              <w:t>Delete a provider</w:t>
+            </w:r>
+          </w:p>
+        </w:tc>
+        <w:tc>
+          <w:tcPr>
+            <w:tcW w:w="4069" w:type="dxa"/>
+          </w:tcPr>
+          <w:p>
+            <w:pPr>
+              <w:rPr>
+                <w:sz w:val="22"/>
+                <w:szCs w:val="22"/>
+              </w:rPr>
+            </w:pPr>
+            <w:r>
+              <w:rPr>
+                <w:sz w:val="22"/>
+                <w:szCs w:val="22"/>
+              </w:rPr>
+              <w:t>DELETE: /api/admin/delete-provider/{providerId}</w:t>
+            </w:r>
+          </w:p>
+        </w:tc>
+        <w:tc>
+          <w:tcPr>
+            <w:tcW w:w="1313" w:type="dxa"/>
+          </w:tcPr>
+          <w:p>
+            <w:pPr>
+              <w:rPr>
+                <w:sz w:val="22"/>
+                <w:szCs w:val="22"/>
+              </w:rPr>
+            </w:pPr>
+            <w:r>
+              <w:rPr>
+                <w:sz w:val="22"/>
+                <w:szCs w:val="22"/>
+              </w:rPr>
+              <w:t>Delete a particular provider by providing their provider id.</w:t>
+            </w:r>
+          </w:p>
+        </w:tc>
+        <w:tc>
+          <w:tcPr>
+            <w:tcW w:w="1127" w:type="dxa"/>
+          </w:tcPr>
+          <w:p>
+            <w:pPr>
+              <w:rPr>
+                <w:sz w:val="22"/>
+                <w:szCs w:val="22"/>
+              </w:rPr>
+            </w:pPr>
+            <w:r>
+              <w:rPr>
+                <w:sz w:val="22"/>
+                <w:szCs w:val="22"/>
+              </w:rPr>
+              <w:t>Admin</w:t>
+            </w:r>
+          </w:p>
+        </w:tc>
+      </w:tr>
+      <w:tr>
+        <w:tc>
+          <w:tcPr>
+            <w:tcW w:w="1422" w:type="dxa"/>
+          </w:tcPr>
+          <w:p>
+            <w:pPr>
+              <w:rPr>
+                <w:sz w:val="22"/>
+                <w:szCs w:val="22"/>
+              </w:rPr>
+            </w:pPr>
+            <w:r>
+              <w:rPr>
+                <w:sz w:val="22"/>
+                <w:szCs w:val="22"/>
+              </w:rPr>
+              <w:t xml:space="preserve">Admin Controller </w:t>
+            </w:r>
+          </w:p>
+        </w:tc>
+        <w:tc>
+          <w:tcPr>
+            <w:tcW w:w="1090" w:type="dxa"/>
+          </w:tcPr>
+          <w:p>
+            <w:pPr>
+              <w:rPr>
+                <w:sz w:val="22"/>
+                <w:szCs w:val="22"/>
+              </w:rPr>
+            </w:pPr>
+            <w:r>
+              <w:rPr>
+                <w:sz w:val="22"/>
+                <w:szCs w:val="22"/>
+              </w:rPr>
+              <w:t>Get providers by location</w:t>
+            </w:r>
+          </w:p>
+        </w:tc>
+        <w:tc>
+          <w:tcPr>
+            <w:tcW w:w="4069" w:type="dxa"/>
+          </w:tcPr>
+          <w:p>
+            <w:pPr>
+              <w:rPr>
+                <w:sz w:val="22"/>
+                <w:szCs w:val="22"/>
+              </w:rPr>
+            </w:pPr>
+            <w:r>
+              <w:rPr>
+                <w:sz w:val="22"/>
+                <w:szCs w:val="22"/>
+              </w:rPr>
+              <w:t>GET: /api/admin/get-provider-location</w:t>
+            </w:r>
+          </w:p>
+        </w:tc>
+        <w:tc>
+          <w:tcPr>
+            <w:tcW w:w="1313" w:type="dxa"/>
+          </w:tcPr>
+          <w:p>
+            <w:pPr>
+              <w:rPr>
+                <w:sz w:val="22"/>
+                <w:szCs w:val="22"/>
+              </w:rPr>
+            </w:pPr>
+            <w:r>
+              <w:rPr>
+                <w:sz w:val="22"/>
+                <w:szCs w:val="22"/>
+              </w:rPr>
+              <w:t>Get list of all types of providers based on a specific location passed through query parameters.</w:t>
+            </w:r>
+          </w:p>
+        </w:tc>
+        <w:tc>
+          <w:tcPr>
+            <w:tcW w:w="1127" w:type="dxa"/>
+          </w:tcPr>
+          <w:p>
+            <w:pPr>
+              <w:rPr>
+                <w:sz w:val="22"/>
+                <w:szCs w:val="22"/>
+              </w:rPr>
+            </w:pPr>
+            <w:r>
+              <w:rPr>
+                <w:sz w:val="22"/>
+                <w:szCs w:val="22"/>
+              </w:rPr>
+              <w:t>Admin</w:t>
+            </w:r>
+          </w:p>
+        </w:tc>
+      </w:tr>
+      <w:tr>
+        <w:tc>
+          <w:tcPr>
+            <w:tcW w:w="1422" w:type="dxa"/>
+          </w:tcPr>
+          <w:p>
+            <w:pPr>
+              <w:rPr>
+                <w:sz w:val="22"/>
+                <w:szCs w:val="22"/>
+              </w:rPr>
+            </w:pPr>
+            <w:r>
+              <w:rPr>
+                <w:sz w:val="22"/>
+                <w:szCs w:val="22"/>
+              </w:rPr>
+              <w:t>Admin Controller</w:t>
+            </w:r>
+          </w:p>
+        </w:tc>
+        <w:tc>
+          <w:tcPr>
+            <w:tcW w:w="1090" w:type="dxa"/>
+          </w:tcPr>
+          <w:p>
+            <w:pPr>
+              <w:rPr>
+                <w:sz w:val="22"/>
+                <w:szCs w:val="22"/>
+              </w:rPr>
+            </w:pPr>
+            <w:r>
+              <w:rPr>
+                <w:sz w:val="22"/>
+                <w:szCs w:val="22"/>
+              </w:rPr>
+              <w:t>Get relevant providers</w:t>
+            </w:r>
+          </w:p>
+        </w:tc>
+        <w:tc>
+          <w:tcPr>
+            <w:tcW w:w="4069" w:type="dxa"/>
+          </w:tcPr>
+          <w:p>
+            <w:pPr>
+              <w:rPr>
+                <w:sz w:val="22"/>
+                <w:szCs w:val="22"/>
+              </w:rPr>
+            </w:pPr>
+            <w:r>
+              <w:rPr>
+                <w:sz w:val="22"/>
+                <w:szCs w:val="22"/>
+              </w:rPr>
+              <w:t>GET: /api/admin/get-provider-relevant</w:t>
+            </w:r>
+          </w:p>
+        </w:tc>
+        <w:tc>
+          <w:tcPr>
+            <w:tcW w:w="1313" w:type="dxa"/>
+          </w:tcPr>
+          <w:p>
+            <w:pPr>
+              <w:rPr>
+                <w:sz w:val="22"/>
+                <w:szCs w:val="22"/>
+              </w:rPr>
+            </w:pPr>
+            <w:r>
+              <w:rPr>
+                <w:sz w:val="22"/>
+                <w:szCs w:val="22"/>
+              </w:rPr>
+              <w:t xml:space="preserve">Get a list of all the relevant providers based on their location </w:t>
             </w:r>
             <w:r>
               <w:rPr>
@@ -1158,7 +2078,7 @@
                 <w:szCs w:val="22"/>
               </w:rPr>
               <w:lastRenderedPageBreak/>
-              <w:t>by providing their customer id.</w:t>
+              <w:t>and type of service provided.</w:t>
             </w:r>
           </w:p>
         </w:tc>
@@ -1201,7 +2121,7 @@
                 <w:sz w:val="22"/>
                 <w:szCs w:val="22"/>
               </w:rPr>
-              <w:t>Admin Customer</w:t>
+              <w:t>Admin Controller</w:t>
             </w:r>
           </w:p>
         </w:tc>
@@ -1221,7 +2141,7 @@
                 <w:sz w:val="22"/>
                 <w:szCs w:val="22"/>
               </w:rPr>
-              <w:t>Get a list of all the providers</w:t>
+              <w:t>Create a service</w:t>
             </w:r>
           </w:p>
         </w:tc>
@@ -1241,7 +2161,7 @@
                 <w:sz w:val="22"/>
                 <w:szCs w:val="22"/>
               </w:rPr>
-              <w:t>GET: /api/admin/get-providers</w:t>
+              <w:t>POST: /api/admin/create-service</w:t>
             </w:r>
           </w:p>
         </w:tc>
@@ -1261,7 +2181,7 @@
                 <w:sz w:val="22"/>
                 <w:szCs w:val="22"/>
               </w:rPr>
-              <w:t>Get a list of all the registered providers.</w:t>
+              <w:t>Used to create a new type service.</w:t>
             </w:r>
           </w:p>
         </w:tc>
@@ -1323,7 +2243,7 @@
                 <w:sz w:val="22"/>
                 <w:szCs w:val="22"/>
               </w:rPr>
-              <w:t>Get a specific provider</w:t>
+              <w:t>Find a service</w:t>
             </w:r>
           </w:p>
         </w:tc>
@@ -1343,7 +2263,7 @@
                 <w:sz w:val="22"/>
                 <w:szCs w:val="22"/>
               </w:rPr>
-              <w:t>GET: /api/admin/get-providers/{providerId}</w:t>
+              <w:t>GET: /api/admin/get-service/{serviceId}</w:t>
             </w:r>
           </w:p>
         </w:tc>
@@ -1363,7 +2283,7 @@
                 <w:sz w:val="22"/>
                 <w:szCs w:val="22"/>
               </w:rPr>
-              <w:t>Get a specific provider by their provider id.</w:t>
+              <w:t>Fetch a particular service by their service id.</w:t>
             </w:r>
           </w:p>
         </w:tc>
@@ -1425,7 +2345,7 @@
                 <w:sz w:val="22"/>
                 <w:szCs w:val="22"/>
               </w:rPr>
-              <w:t>Create a provider</w:t>
+              <w:t>Find all services</w:t>
             </w:r>
           </w:p>
         </w:tc>
@@ -1445,28 +2365,7 @@
                 <w:sz w:val="22"/>
                 <w:szCs w:val="22"/>
               </w:rPr>
-              <w:t xml:space="preserve">POST: </w:t>
-            </w:r>
-            <w:r>
-              <w:rPr>
-                <w:sz w:val="22"/>
-                <w:szCs w:val="22"/>
-              </w:rPr>
-              <w:t>/api/admin</w:t>
-            </w:r>
-            <w:r>
-              <w:rPr>
-                <w:sz w:val="22"/>
-                <w:szCs w:val="22"/>
-              </w:rPr>
-              <w:t>/</w:t>
-            </w:r>
-            <w:r>
-              <w:rPr>
-                <w:sz w:val="22"/>
-                <w:szCs w:val="22"/>
-              </w:rPr>
-              <w:t>create-provider</w:t>
+              <w:t>GET: /api/admin/get-service</w:t>
             </w:r>
           </w:p>
         </w:tc>
@@ -1486,7 +2385,7 @@
                 <w:sz w:val="22"/>
                 <w:szCs w:val="22"/>
               </w:rPr>
-              <w:t>Create a provider through Admin</w:t>
+              <w:t>Fetch all the present offering services.</w:t>
             </w:r>
           </w:p>
         </w:tc>
@@ -1548,7 +2447,7 @@
                 <w:sz w:val="22"/>
                 <w:szCs w:val="22"/>
               </w:rPr>
-              <w:t>Update a provider</w:t>
+              <w:t>Find all bookings</w:t>
             </w:r>
           </w:p>
         </w:tc>
@@ -1568,7 +2467,7 @@
                 <w:sz w:val="22"/>
                 <w:szCs w:val="22"/>
               </w:rPr>
-              <w:t>PUT: /api/admin/update-provider</w:t>
+              <w:t>GET: /api/admin/get-all/bookings</w:t>
             </w:r>
           </w:p>
         </w:tc>
@@ -1588,7 +2487,7 @@
                 <w:sz w:val="22"/>
                 <w:szCs w:val="22"/>
               </w:rPr>
-              <w:t>Update details of a particular provider.</w:t>
+              <w:t>Fetch all the recent bookings.</w:t>
             </w:r>
           </w:p>
         </w:tc>
@@ -1650,7 +2549,7 @@
                 <w:sz w:val="22"/>
                 <w:szCs w:val="22"/>
               </w:rPr>
-              <w:t>Delete a provider</w:t>
+              <w:t>Update password</w:t>
             </w:r>
           </w:p>
         </w:tc>
@@ -1670,8 +2569,30 @@
                 <w:sz w:val="22"/>
                 <w:szCs w:val="22"/>
               </w:rPr>
-              <w:t>DELETE: /api/admin/delete-provider/{providerId}</w:t>
-            </w:r>
+              <w:t xml:space="preserve">PUT: </w:t>
+            </w:r>
+            <w:r>
+              <w:rPr>
+                <w:sz w:val="22"/>
+                <w:szCs w:val="22"/>
+              </w:rPr>
+              <w:t>/api/admin</w:t>
+            </w:r>
+            <w:r>
+              <w:rPr>
+                <w:sz w:val="22"/>
+                <w:szCs w:val="22"/>
+              </w:rPr>
+              <w:t>/update-password/{username}/{newPassword}</w:t>
+            </w:r>
+          </w:p>
+          <w:p>
+            <w:pPr>
+              <w:rPr>
+                <w:sz w:val="22"/>
+                <w:szCs w:val="22"/>
+              </w:rPr>
+            </w:pPr>
           </w:p>
         </w:tc>
         <w:tc>
@@ -1690,7 +2611,7 @@
                 <w:sz w:val="22"/>
                 <w:szCs w:val="22"/>
               </w:rPr>
-              <w:t>Delete a particular provider by providing their provider id.</w:t>
+              <w:t>Update password of any user by their username</w:t>
             </w:r>
           </w:p>
         </w:tc>
@@ -1732,7 +2653,7 @@
                 <w:sz w:val="22"/>
                 <w:szCs w:val="22"/>
               </w:rPr>
-              <w:t xml:space="preserve">Admin Controller </w:t>
+              <w:t>Booking Controller</w:t>
             </w:r>
           </w:p>
         </w:tc>
@@ -1752,7 +2673,7 @@
                 <w:sz w:val="22"/>
                 <w:szCs w:val="22"/>
               </w:rPr>
-              <w:t>Get providers by location</w:t>
+              <w:t>Book a request</w:t>
             </w:r>
           </w:p>
         </w:tc>
@@ -1772,7 +2693,14 @@
                 <w:sz w:val="22"/>
                 <w:szCs w:val="22"/>
               </w:rPr>
-              <w:t>GET: /api/admin/get-provider-location</w:t>
+              <w:t xml:space="preserve">POST: </w:t>
+            </w:r>
+            <w:r>
+              <w:rPr>
+                <w:sz w:val="22"/>
+                <w:szCs w:val="22"/>
+              </w:rPr>
+              <w:t>/api/bookings/book-request</w:t>
             </w:r>
           </w:p>
         </w:tc>
@@ -1792,7 +2720,7 @@
                 <w:sz w:val="22"/>
                 <w:szCs w:val="22"/>
               </w:rPr>
-              <w:t>Get list of all types of providers based on a specific location passed through query parameters.</w:t>
+              <w:t>Allows a customer to book a request</w:t>
             </w:r>
           </w:p>
         </w:tc>
@@ -1812,7 +2740,7 @@
                 <w:sz w:val="22"/>
                 <w:szCs w:val="22"/>
               </w:rPr>
-              <w:t>Admin</w:t>
+              <w:t>Customer</w:t>
             </w:r>
           </w:p>
         </w:tc>
@@ -1834,7 +2762,7 @@
                 <w:sz w:val="22"/>
                 <w:szCs w:val="22"/>
               </w:rPr>
-              <w:t>Admin Controller</w:t>
+              <w:t>Booking Controller</w:t>
             </w:r>
           </w:p>
         </w:tc>
@@ -1854,7 +2782,7 @@
                 <w:sz w:val="22"/>
                 <w:szCs w:val="22"/>
               </w:rPr>
-              <w:t>Get relevant providers</w:t>
+              <w:t>Get booked requests</w:t>
             </w:r>
           </w:p>
         </w:tc>
@@ -1874,7 +2802,14 @@
                 <w:sz w:val="22"/>
                 <w:szCs w:val="22"/>
               </w:rPr>
-              <w:t>GET: /api/admin/get-provider-relevant</w:t>
+              <w:t>GET: /api/bookings/get-booked</w:t>
+            </w:r>
+            <w:r>
+              <w:rPr>
+                <w:sz w:val="22"/>
+                <w:szCs w:val="22"/>
+              </w:rPr>
+              <w:t>-requests</w:t>
             </w:r>
           </w:p>
         </w:tc>
@@ -1894,7 +2829,14 @@
                 <w:sz w:val="22"/>
                 <w:szCs w:val="22"/>
               </w:rPr>
-              <w:t>Get a list of all the relevant providers based on their location and type of service provided.</w:t>
+              <w:t xml:space="preserve">Fetch all the booked requests </w:t>
+            </w:r>
+            <w:r>
+              <w:rPr>
+                <w:sz w:val="22"/>
+                <w:szCs w:val="22"/>
+              </w:rPr>
+              <w:t>by a customer</w:t>
             </w:r>
           </w:p>
         </w:tc>
@@ -1914,7 +2856,7 @@
                 <w:sz w:val="22"/>
                 <w:szCs w:val="22"/>
               </w:rPr>
-              <w:t>Admin</w:t>
+              <w:t>Customer</w:t>
             </w:r>
           </w:p>
         </w:tc>
@@ -1936,7 +2878,7 @@
                 <w:sz w:val="22"/>
                 <w:szCs w:val="22"/>
               </w:rPr>
-              <w:t>Admin Controller</w:t>
+              <w:t>Booking Controller</w:t>
             </w:r>
           </w:p>
         </w:tc>
@@ -1956,7 +2898,14 @@
                 <w:sz w:val="22"/>
                 <w:szCs w:val="22"/>
               </w:rPr>
-              <w:t>Create a service</w:t>
+              <w:t xml:space="preserve">Revoke a </w:t>
+            </w:r>
+            <w:r>
+              <w:rPr>
+                <w:sz w:val="22"/>
+                <w:szCs w:val="22"/>
+              </w:rPr>
+              <w:t>request</w:t>
             </w:r>
           </w:p>
         </w:tc>
@@ -1976,7 +2925,14 @@
                 <w:sz w:val="22"/>
                 <w:szCs w:val="22"/>
               </w:rPr>
-              <w:t>POST: /api/admin/create-service</w:t>
+              <w:t xml:space="preserve">PUT: </w:t>
+            </w:r>
+            <w:r>
+              <w:rPr>
+                <w:sz w:val="22"/>
+                <w:szCs w:val="22"/>
+              </w:rPr>
+              <w:t>/api/bookings/revoke-booking/{bookingId}</w:t>
             </w:r>
           </w:p>
         </w:tc>
@@ -1996,15 +2952,7 @@
                 <w:sz w:val="22"/>
                 <w:szCs w:val="22"/>
               </w:rPr>
-              <w:t xml:space="preserve">Used to create a </w:t>
-            </w:r>
-            <w:r>
-              <w:rPr>
-                <w:sz w:val="22"/>
-                <w:szCs w:val="22"/>
-              </w:rPr>
-              <w:lastRenderedPageBreak/>
-              <w:t>new type service.</w:t>
+              <w:t>Revoke a request</w:t>
             </w:r>
           </w:p>
         </w:tc>
@@ -2024,8 +2972,7 @@
                 <w:sz w:val="22"/>
                 <w:szCs w:val="22"/>
               </w:rPr>
-              <w:lastRenderedPageBreak/>
-              <w:t>Admin</w:t>
+              <w:t>Customer</w:t>
             </w:r>
           </w:p>
         </w:tc>
@@ -2047,7 +2994,7 @@
                 <w:sz w:val="22"/>
                 <w:szCs w:val="22"/>
               </w:rPr>
-              <w:t>Admin Controller</w:t>
+              <w:t>Booking Controller</w:t>
             </w:r>
           </w:p>
         </w:tc>
@@ -2067,7 +3014,7 @@
                 <w:sz w:val="22"/>
                 <w:szCs w:val="22"/>
               </w:rPr>
-              <w:t>Find a service</w:t>
+              <w:t>Accept a request</w:t>
             </w:r>
           </w:p>
         </w:tc>
@@ -2087,7 +3034,14 @@
                 <w:sz w:val="22"/>
                 <w:szCs w:val="22"/>
               </w:rPr>
-              <w:t>GET: /api/admin/get-service/{serviceId}</w:t>
+              <w:t>PUT: /</w:t>
+            </w:r>
+            <w:r>
+              <w:rPr>
+                <w:sz w:val="22"/>
+                <w:szCs w:val="22"/>
+              </w:rPr>
+              <w:t>api/bookings/accept-request/{bookingId}</w:t>
             </w:r>
           </w:p>
         </w:tc>
@@ -2107,7 +3061,7 @@
                 <w:sz w:val="22"/>
                 <w:szCs w:val="22"/>
               </w:rPr>
-              <w:t>Fetch a particular service by their service id.</w:t>
+              <w:t>Accept a request by a customer</w:t>
             </w:r>
           </w:p>
         </w:tc>
@@ -2127,7 +3081,7 @@
                 <w:sz w:val="22"/>
                 <w:szCs w:val="22"/>
               </w:rPr>
-              <w:t>Admin</w:t>
+              <w:t>Provider</w:t>
             </w:r>
           </w:p>
         </w:tc>
@@ -2149,7 +3103,7 @@
                 <w:sz w:val="22"/>
                 <w:szCs w:val="22"/>
               </w:rPr>
-              <w:t>Admin Controller</w:t>
+              <w:t>Booking Controller</w:t>
             </w:r>
           </w:p>
         </w:tc>
@@ -2169,7 +3123,7 @@
                 <w:sz w:val="22"/>
                 <w:szCs w:val="22"/>
               </w:rPr>
-              <w:t>Find all services</w:t>
+              <w:t>Reject a request</w:t>
             </w:r>
           </w:p>
         </w:tc>
@@ -2189,7 +3143,7 @@
                 <w:sz w:val="22"/>
                 <w:szCs w:val="22"/>
               </w:rPr>
-              <w:t>GET: /api/admin/get-service</w:t>
+              <w:t>PUT: /api/booking/reject-booking/{bookingId}</w:t>
             </w:r>
           </w:p>
         </w:tc>
@@ -2209,7 +3163,21 @@
                 <w:sz w:val="22"/>
                 <w:szCs w:val="22"/>
               </w:rPr>
-              <w:t>Fetch all the present offering services.</w:t>
+              <w:t>Reject a</w:t>
+            </w:r>
+            <w:r>
+              <w:rPr>
+                <w:sz w:val="22"/>
+                <w:szCs w:val="22"/>
+              </w:rPr>
+              <w:t>n incoming</w:t>
+            </w:r>
+            <w:r>
+              <w:rPr>
+                <w:sz w:val="22"/>
+                <w:szCs w:val="22"/>
+              </w:rPr>
+              <w:t xml:space="preserve"> booking</w:t>
             </w:r>
           </w:p>
         </w:tc>
@@ -2229,7 +3197,7 @@
                 <w:sz w:val="22"/>
                 <w:szCs w:val="22"/>
               </w:rPr>
-              <w:t>Admin</w:t>
+              <w:t>Provider</w:t>
             </w:r>
           </w:p>
         </w:tc>
@@ -2251,7 +3219,7 @@
                 <w:sz w:val="22"/>
                 <w:szCs w:val="22"/>
               </w:rPr>
-              <w:t>Admin Controller</w:t>
+              <w:t>Booking Controller</w:t>
             </w:r>
           </w:p>
         </w:tc>
@@ -2271,7 +3239,7 @@
                 <w:sz w:val="22"/>
                 <w:szCs w:val="22"/>
               </w:rPr>
-              <w:t>Find all bookings</w:t>
+              <w:t>Get all requests</w:t>
             </w:r>
           </w:p>
         </w:tc>
@@ -2291,7 +3259,7 @@
                 <w:sz w:val="22"/>
                 <w:szCs w:val="22"/>
               </w:rPr>
-              <w:t>GET: /api/admin/get-all/bookings</w:t>
+              <w:t>GET: /api/booking/all-received-requests</w:t>
             </w:r>
           </w:p>
         </w:tc>
@@ -2311,7 +3279,7 @@
                 <w:sz w:val="22"/>
                 <w:szCs w:val="22"/>
               </w:rPr>
-              <w:t>Fetch all the recent bookings.</w:t>
+              <w:t>Fetch all the incoming requests</w:t>
             </w:r>
           </w:p>
         </w:tc>
@@ -2331,7 +3299,7 @@
                 <w:sz w:val="22"/>
                 <w:szCs w:val="22"/>
               </w:rPr>
-              <w:t>Admin</w:t>
+              <w:t>Provider</w:t>
             </w:r>
           </w:p>
         </w:tc>
@@ -2353,7 +3321,7 @@
                 <w:sz w:val="22"/>
                 <w:szCs w:val="22"/>
               </w:rPr>
-              <w:t>Admin Controller</w:t>
+              <w:t>Booking Controller</w:t>
             </w:r>
           </w:p>
         </w:tc>
@@ -2373,7 +3341,14 @@
                 <w:sz w:val="22"/>
                 <w:szCs w:val="22"/>
               </w:rPr>
-              <w:t>Update password</w:t>
+              <w:t>Complete a serv</w:t>
+            </w:r>
+            <w:r>
+              <w:rPr>
+                <w:sz w:val="22"/>
+                <w:szCs w:val="22"/>
+              </w:rPr>
+              <w:t>ice</w:t>
             </w:r>
           </w:p>
         </w:tc>
@@ -2393,30 +3368,8 @@
                 <w:sz w:val="22"/>
                 <w:szCs w:val="22"/>
               </w:rPr>
-              <w:t xml:space="preserve">PUT: </w:t>
-            </w:r>
-            <w:r>
-              <w:rPr>
-                <w:sz w:val="22"/>
-                <w:szCs w:val="22"/>
-              </w:rPr>
-              <w:t>/api/admin</w:t>
-            </w:r>
-            <w:r>
-              <w:rPr>
-                <w:sz w:val="22"/>
-                <w:szCs w:val="22"/>
-              </w:rPr>
-              <w:t>/update-password/{username}/{newPassword}</w:t>
-            </w:r>
-          </w:p>
-          <w:p>
-            <w:pPr>
-              <w:rPr>
-                <w:sz w:val="22"/>
-                <w:szCs w:val="22"/>
-              </w:rPr>
-            </w:pPr>
+              <w:t>PUT: /api/booking/complete/{bookingId}</w:t>
+            </w:r>
           </w:p>
         </w:tc>
         <w:tc>
@@ -2435,7 +3388,7 @@
                 <w:sz w:val="22"/>
                 <w:szCs w:val="22"/>
               </w:rPr>
-              <w:t>Update password of any user by their username</w:t>
+              <w:t>Complete a request by both customer and provider</w:t>
             </w:r>
           </w:p>
         </w:tc>
@@ -2455,7 +3408,7 @@
                 <w:sz w:val="22"/>
                 <w:szCs w:val="22"/>
               </w:rPr>
-              <w:t>Admin</w:t>
+              <w:t>Customer / Provider</w:t>
             </w:r>
           </w:p>
         </w:tc>
@@ -2477,7 +3430,8 @@
                 <w:sz w:val="22"/>
                 <w:szCs w:val="22"/>
               </w:rPr>
-              <w:t>Booking Controller</w:t>
+              <w:lastRenderedPageBreak/>
+              <w:t>Customer Controller</w:t>
             </w:r>
           </w:p>
         </w:tc>
@@ -2497,7 +3451,7 @@
                 <w:sz w:val="22"/>
                 <w:szCs w:val="22"/>
               </w:rPr>
-              <w:t>Book a request</w:t>
+              <w:t>Update Customer</w:t>
             </w:r>
           </w:p>
         </w:tc>
@@ -2517,14 +3471,21 @@
                 <w:sz w:val="22"/>
                 <w:szCs w:val="22"/>
               </w:rPr>
-              <w:t xml:space="preserve">POST: </w:t>
-            </w:r>
-            <w:r>
-              <w:rPr>
-                <w:sz w:val="22"/>
-                <w:szCs w:val="22"/>
-              </w:rPr>
-              <w:t>/api/bookings/book-request</w:t>
+              <w:t xml:space="preserve">PUT: </w:t>
+            </w:r>
+            <w:r>
+              <w:rPr>
+                <w:sz w:val="22"/>
+                <w:szCs w:val="22"/>
+              </w:rPr>
+              <w:t>/api/customer</w:t>
+            </w:r>
+            <w:r>
+              <w:rPr>
+                <w:sz w:val="22"/>
+                <w:szCs w:val="22"/>
+              </w:rPr>
+              <w:t>/update-customer/{customerId}</w:t>
             </w:r>
           </w:p>
         </w:tc>
@@ -2544,7 +3505,7 @@
                 <w:sz w:val="22"/>
                 <w:szCs w:val="22"/>
               </w:rPr>
-              <w:t>Allows a customer to book a request</w:t>
+              <w:t>Update details of customer by their username</w:t>
             </w:r>
           </w:p>
         </w:tc>
@@ -2586,7 +3547,7 @@
                 <w:sz w:val="22"/>
                 <w:szCs w:val="22"/>
               </w:rPr>
-              <w:t>Booking Controller</w:t>
+              <w:t>Customer Controller</w:t>
             </w:r>
           </w:p>
         </w:tc>
@@ -2606,7 +3567,7 @@
                 <w:sz w:val="22"/>
                 <w:szCs w:val="22"/>
               </w:rPr>
-              <w:t>Get booked requests</w:t>
+              <w:t>Rate provider</w:t>
             </w:r>
           </w:p>
         </w:tc>
@@ -2626,15 +3587,30 @@
                 <w:sz w:val="22"/>
                 <w:szCs w:val="22"/>
               </w:rPr>
-              <w:t>GET: /api/bookings/get-booked</w:t>
-            </w:r>
-            <w:r>
-              <w:rPr>
-                <w:sz w:val="22"/>
-                <w:szCs w:val="22"/>
-              </w:rPr>
-              <w:t>-requests</w:t>
-            </w:r>
+              <w:t xml:space="preserve">POST: </w:t>
+            </w:r>
+            <w:r>
+              <w:rPr>
+                <w:sz w:val="22"/>
+                <w:szCs w:val="22"/>
+              </w:rPr>
+              <w:t>/api/customer</w:t>
+            </w:r>
+            <w:r>
+              <w:rPr>
+                <w:sz w:val="22"/>
+                <w:szCs w:val="22"/>
+              </w:rPr>
+              <w:t>/rate-provider/{customerId}/{bookingId}/{ratingValue}</w:t>
+            </w:r>
+          </w:p>
+          <w:p>
+            <w:pPr>
+              <w:rPr>
+                <w:sz w:val="22"/>
+                <w:szCs w:val="22"/>
+              </w:rPr>
+            </w:pPr>
           </w:p>
         </w:tc>
         <w:tc>
@@ -2653,14 +3629,7 @@
                 <w:sz w:val="22"/>
                 <w:szCs w:val="22"/>
               </w:rPr>
-              <w:t xml:space="preserve">Fetch all the booked requests </w:t>
-            </w:r>
-            <w:r>
-              <w:rPr>
-                <w:sz w:val="22"/>
-                <w:szCs w:val="22"/>
-              </w:rPr>
-              <w:t>by a customer</w:t>
+              <w:t>Rate a provider based on booking</w:t>
             </w:r>
           </w:p>
         </w:tc>
@@ -2702,7 +3671,7 @@
                 <w:sz w:val="22"/>
                 <w:szCs w:val="22"/>
               </w:rPr>
-              <w:t>Booking Controller</w:t>
+              <w:t>Customer Controller</w:t>
             </w:r>
           </w:p>
         </w:tc>
@@ -2722,14 +3691,7 @@
                 <w:sz w:val="22"/>
                 <w:szCs w:val="22"/>
               </w:rPr>
-              <w:t xml:space="preserve">Revoke a </w:t>
-            </w:r>
-            <w:r>
-              <w:rPr>
-                <w:sz w:val="22"/>
-                <w:szCs w:val="22"/>
-              </w:rPr>
-              <w:t>request</w:t>
+              <w:t>See profile</w:t>
             </w:r>
           </w:p>
         </w:tc>
@@ -2749,14 +3711,21 @@
                 <w:sz w:val="22"/>
                 <w:szCs w:val="22"/>
               </w:rPr>
-              <w:t xml:space="preserve">PUT: </w:t>
-            </w:r>
-            <w:r>
-              <w:rPr>
-                <w:sz w:val="22"/>
-                <w:szCs w:val="22"/>
-              </w:rPr>
-              <w:t>/api/bookings/revoke-booking/{bookingId}</w:t>
+              <w:t xml:space="preserve">GET: </w:t>
+            </w:r>
+            <w:r>
+              <w:rPr>
+                <w:sz w:val="22"/>
+                <w:szCs w:val="22"/>
+              </w:rPr>
+              <w:t>/api/customer</w:t>
+            </w:r>
+            <w:r>
+              <w:rPr>
+                <w:sz w:val="22"/>
+                <w:szCs w:val="22"/>
+              </w:rPr>
+              <w:t>/get-profile/{customerId}</w:t>
             </w:r>
           </w:p>
         </w:tc>
@@ -2776,7 +3745,7 @@
                 <w:sz w:val="22"/>
                 <w:szCs w:val="22"/>
               </w:rPr>
-              <w:t>Revoke a request</w:t>
+              <w:t>See their profile details</w:t>
             </w:r>
           </w:p>
         </w:tc>
@@ -2818,7 +3787,7 @@
                 <w:sz w:val="22"/>
                 <w:szCs w:val="22"/>
               </w:rPr>
-              <w:t>Booking Controller</w:t>
+              <w:t>Provider Controller</w:t>
             </w:r>
           </w:p>
         </w:tc>
@@ -2838,7 +3807,7 @@
                 <w:sz w:val="22"/>
                 <w:szCs w:val="22"/>
               </w:rPr>
-              <w:t>Accept a request</w:t>
+              <w:t>Update provider</w:t>
             </w:r>
           </w:p>
         </w:tc>
@@ -2858,15 +3827,30 @@
                 <w:sz w:val="22"/>
                 <w:szCs w:val="22"/>
               </w:rPr>
-              <w:t>PUT: /</w:t>
-            </w:r>
-            <w:r>
-              <w:rPr>
-                <w:sz w:val="22"/>
-                <w:szCs w:val="22"/>
-              </w:rPr>
-              <w:t>api/bookings/accept-request/{bookingId}</w:t>
-            </w:r>
+              <w:t xml:space="preserve">PUT: </w:t>
+            </w:r>
+            <w:r>
+              <w:rPr>
+                <w:sz w:val="22"/>
+                <w:szCs w:val="22"/>
+              </w:rPr>
+              <w:t>/api/provider</w:t>
+            </w:r>
+            <w:r>
+              <w:rPr>
+                <w:sz w:val="22"/>
+                <w:szCs w:val="22"/>
+              </w:rPr>
+              <w:t>/update-provider/{providerId}</w:t>
+            </w:r>
+          </w:p>
+          <w:p>
+            <w:pPr>
+              <w:rPr>
+                <w:sz w:val="22"/>
+                <w:szCs w:val="22"/>
+              </w:rPr>
+            </w:pPr>
           </w:p>
         </w:tc>
         <w:tc>
@@ -2885,829 +3869,7 @@
                 <w:sz w:val="22"/>
                 <w:szCs w:val="22"/>
               </w:rPr>
-              <w:t>Accept a request by a customer</w:t>
-            </w:r>
-          </w:p>
-        </w:tc>
-        <w:tc>
-          <w:tcPr>
-            <w:tcW w:w="1127" w:type="dxa"/>
-          </w:tcPr>
-          <w:p>
-            <w:pPr>
-              <w:rPr>
-                <w:sz w:val="22"/>
-                <w:szCs w:val="22"/>
-              </w:rPr>
-            </w:pPr>
-            <w:r>
-              <w:rPr>
-                <w:sz w:val="22"/>
-                <w:szCs w:val="22"/>
-              </w:rPr>
-              <w:t>Provider</w:t>
-            </w:r>
-          </w:p>
-        </w:tc>
-      </w:tr>
-      <w:tr>
-        <w:tc>
-          <w:tcPr>
-            <w:tcW w:w="1422" w:type="dxa"/>
-          </w:tcPr>
-          <w:p>
-            <w:pPr>
-              <w:rPr>
-                <w:sz w:val="22"/>
-                <w:szCs w:val="22"/>
-              </w:rPr>
-            </w:pPr>
-            <w:r>
-              <w:rPr>
-                <w:sz w:val="22"/>
-                <w:szCs w:val="22"/>
-              </w:rPr>
-              <w:t>Booking Controller</w:t>
-            </w:r>
-          </w:p>
-        </w:tc>
-        <w:tc>
-          <w:tcPr>
-            <w:tcW w:w="1090" w:type="dxa"/>
-          </w:tcPr>
-          <w:p>
-            <w:pPr>
-              <w:rPr>
-                <w:sz w:val="22"/>
-                <w:szCs w:val="22"/>
-              </w:rPr>
-            </w:pPr>
-            <w:r>
-              <w:rPr>
-                <w:sz w:val="22"/>
-                <w:szCs w:val="22"/>
-              </w:rPr>
-              <w:t>Reject a request</w:t>
-            </w:r>
-          </w:p>
-        </w:tc>
-        <w:tc>
-          <w:tcPr>
-            <w:tcW w:w="4069" w:type="dxa"/>
-          </w:tcPr>
-          <w:p>
-            <w:pPr>
-              <w:rPr>
-                <w:sz w:val="22"/>
-                <w:szCs w:val="22"/>
-              </w:rPr>
-            </w:pPr>
-            <w:r>
-              <w:rPr>
-                <w:sz w:val="22"/>
-                <w:szCs w:val="22"/>
-              </w:rPr>
-              <w:t>PUT: /api/booking/reject-booking/{bookingId}</w:t>
-            </w:r>
-          </w:p>
-        </w:tc>
-        <w:tc>
-          <w:tcPr>
-            <w:tcW w:w="1313" w:type="dxa"/>
-          </w:tcPr>
-          <w:p>
-            <w:pPr>
-              <w:rPr>
-                <w:sz w:val="22"/>
-                <w:szCs w:val="22"/>
-              </w:rPr>
-            </w:pPr>
-            <w:r>
-              <w:rPr>
-                <w:sz w:val="22"/>
-                <w:szCs w:val="22"/>
-              </w:rPr>
-              <w:t>Reject a</w:t>
-            </w:r>
-            <w:r>
-              <w:rPr>
-                <w:sz w:val="22"/>
-                <w:szCs w:val="22"/>
-              </w:rPr>
-              <w:t>n incoming</w:t>
-            </w:r>
-            <w:r>
-              <w:rPr>
-                <w:sz w:val="22"/>
-                <w:szCs w:val="22"/>
-              </w:rPr>
-              <w:t xml:space="preserve"> booking</w:t>
-            </w:r>
-          </w:p>
-        </w:tc>
-        <w:tc>
-          <w:tcPr>
-            <w:tcW w:w="1127" w:type="dxa"/>
-          </w:tcPr>
-          <w:p>
-            <w:pPr>
-              <w:rPr>
-                <w:sz w:val="22"/>
-                <w:szCs w:val="22"/>
-              </w:rPr>
-            </w:pPr>
-            <w:r>
-              <w:rPr>
-                <w:sz w:val="22"/>
-                <w:szCs w:val="22"/>
-              </w:rPr>
-              <w:t>Provider</w:t>
-            </w:r>
-          </w:p>
-        </w:tc>
-      </w:tr>
-      <w:tr>
-        <w:tc>
-          <w:tcPr>
-            <w:tcW w:w="1422" w:type="dxa"/>
-          </w:tcPr>
-          <w:p>
-            <w:pPr>
-              <w:rPr>
-                <w:sz w:val="22"/>
-                <w:szCs w:val="22"/>
-              </w:rPr>
-            </w:pPr>
-            <w:r>
-              <w:rPr>
-                <w:sz w:val="22"/>
-                <w:szCs w:val="22"/>
-              </w:rPr>
-              <w:t>Booking Controller</w:t>
-            </w:r>
-          </w:p>
-        </w:tc>
-        <w:tc>
-          <w:tcPr>
-            <w:tcW w:w="1090" w:type="dxa"/>
-          </w:tcPr>
-          <w:p>
-            <w:pPr>
-              <w:rPr>
-                <w:sz w:val="22"/>
-                <w:szCs w:val="22"/>
-              </w:rPr>
-            </w:pPr>
-            <w:r>
-              <w:rPr>
-                <w:sz w:val="22"/>
-                <w:szCs w:val="22"/>
-              </w:rPr>
-              <w:t>Get all requests</w:t>
-            </w:r>
-          </w:p>
-        </w:tc>
-        <w:tc>
-          <w:tcPr>
-            <w:tcW w:w="4069" w:type="dxa"/>
-          </w:tcPr>
-          <w:p>
-            <w:pPr>
-              <w:rPr>
-                <w:sz w:val="22"/>
-                <w:szCs w:val="22"/>
-              </w:rPr>
-            </w:pPr>
-            <w:r>
-              <w:rPr>
-                <w:sz w:val="22"/>
-                <w:szCs w:val="22"/>
-              </w:rPr>
-              <w:t>GET: /api/booking/all-received-requests</w:t>
-            </w:r>
-          </w:p>
-        </w:tc>
-        <w:tc>
-          <w:tcPr>
-            <w:tcW w:w="1313" w:type="dxa"/>
-          </w:tcPr>
-          <w:p>
-            <w:pPr>
-              <w:rPr>
-                <w:sz w:val="22"/>
-                <w:szCs w:val="22"/>
-              </w:rPr>
-            </w:pPr>
-            <w:r>
-              <w:rPr>
-                <w:sz w:val="22"/>
-                <w:szCs w:val="22"/>
-              </w:rPr>
-              <w:t>Fetch all the incoming requests</w:t>
-            </w:r>
-          </w:p>
-        </w:tc>
-        <w:tc>
-          <w:tcPr>
-            <w:tcW w:w="1127" w:type="dxa"/>
-          </w:tcPr>
-          <w:p>
-            <w:pPr>
-              <w:rPr>
-                <w:sz w:val="22"/>
-                <w:szCs w:val="22"/>
-              </w:rPr>
-            </w:pPr>
-            <w:r>
-              <w:rPr>
-                <w:sz w:val="22"/>
-                <w:szCs w:val="22"/>
-              </w:rPr>
-              <w:t>Provider</w:t>
-            </w:r>
-          </w:p>
-        </w:tc>
-      </w:tr>
-      <w:tr>
-        <w:tc>
-          <w:tcPr>
-            <w:tcW w:w="1422" w:type="dxa"/>
-          </w:tcPr>
-          <w:p>
-            <w:pPr>
-              <w:rPr>
-                <w:sz w:val="22"/>
-                <w:szCs w:val="22"/>
-              </w:rPr>
-            </w:pPr>
-            <w:r>
-              <w:rPr>
-                <w:sz w:val="22"/>
-                <w:szCs w:val="22"/>
-              </w:rPr>
-              <w:t>Booking Controller</w:t>
-            </w:r>
-          </w:p>
-        </w:tc>
-        <w:tc>
-          <w:tcPr>
-            <w:tcW w:w="1090" w:type="dxa"/>
-          </w:tcPr>
-          <w:p>
-            <w:pPr>
-              <w:rPr>
-                <w:sz w:val="22"/>
-                <w:szCs w:val="22"/>
-              </w:rPr>
-            </w:pPr>
-            <w:r>
-              <w:rPr>
-                <w:sz w:val="22"/>
-                <w:szCs w:val="22"/>
-              </w:rPr>
-              <w:t>Complete a serv</w:t>
-            </w:r>
-            <w:r>
-              <w:rPr>
-                <w:sz w:val="22"/>
-                <w:szCs w:val="22"/>
-              </w:rPr>
-              <w:t>ice</w:t>
-            </w:r>
-          </w:p>
-        </w:tc>
-        <w:tc>
-          <w:tcPr>
-            <w:tcW w:w="4069" w:type="dxa"/>
-          </w:tcPr>
-          <w:p>
-            <w:pPr>
-              <w:rPr>
-                <w:sz w:val="22"/>
-                <w:szCs w:val="22"/>
-              </w:rPr>
-            </w:pPr>
-            <w:r>
-              <w:rPr>
-                <w:sz w:val="22"/>
-                <w:szCs w:val="22"/>
-              </w:rPr>
-              <w:t>PUT: /api/booking/complete/{bookingId}</w:t>
-            </w:r>
-          </w:p>
-        </w:tc>
-        <w:tc>
-          <w:tcPr>
-            <w:tcW w:w="1313" w:type="dxa"/>
-          </w:tcPr>
-          <w:p>
-            <w:pPr>
-              <w:rPr>
-                <w:sz w:val="22"/>
-                <w:szCs w:val="22"/>
-              </w:rPr>
-            </w:pPr>
-            <w:r>
-              <w:rPr>
-                <w:sz w:val="22"/>
-                <w:szCs w:val="22"/>
-              </w:rPr>
-              <w:t>Complete a request by both customer and provider</w:t>
-            </w:r>
-          </w:p>
-        </w:tc>
-        <w:tc>
-          <w:tcPr>
-            <w:tcW w:w="1127" w:type="dxa"/>
-          </w:tcPr>
-          <w:p>
-            <w:pPr>
-              <w:rPr>
-                <w:sz w:val="22"/>
-                <w:szCs w:val="22"/>
-              </w:rPr>
-            </w:pPr>
-            <w:r>
-              <w:rPr>
-                <w:sz w:val="22"/>
-                <w:szCs w:val="22"/>
-              </w:rPr>
-              <w:t>Customer / Provider</w:t>
-            </w:r>
-          </w:p>
-        </w:tc>
-      </w:tr>
-      <w:tr>
-        <w:tc>
-          <w:tcPr>
-            <w:tcW w:w="1422" w:type="dxa"/>
-          </w:tcPr>
-          <w:p>
-            <w:pPr>
-              <w:rPr>
-                <w:sz w:val="22"/>
-                <w:szCs w:val="22"/>
-              </w:rPr>
-            </w:pPr>
-            <w:r>
-              <w:rPr>
-                <w:sz w:val="22"/>
-                <w:szCs w:val="22"/>
-              </w:rPr>
-              <w:t>Customer Controller</w:t>
-            </w:r>
-          </w:p>
-        </w:tc>
-        <w:tc>
-          <w:tcPr>
-            <w:tcW w:w="1090" w:type="dxa"/>
-          </w:tcPr>
-          <w:p>
-            <w:pPr>
-              <w:rPr>
-                <w:sz w:val="22"/>
-                <w:szCs w:val="22"/>
-              </w:rPr>
-            </w:pPr>
-            <w:r>
-              <w:rPr>
-                <w:sz w:val="22"/>
-                <w:szCs w:val="22"/>
-              </w:rPr>
-              <w:t>Update Customer</w:t>
-            </w:r>
-          </w:p>
-        </w:tc>
-        <w:tc>
-          <w:tcPr>
-            <w:tcW w:w="4069" w:type="dxa"/>
-          </w:tcPr>
-          <w:p>
-            <w:pPr>
-              <w:rPr>
-                <w:sz w:val="22"/>
-                <w:szCs w:val="22"/>
-              </w:rPr>
-            </w:pPr>
-            <w:r>
-              <w:rPr>
-                <w:sz w:val="22"/>
-                <w:szCs w:val="22"/>
-              </w:rPr>
-              <w:t xml:space="preserve">PUT: </w:t>
-            </w:r>
-            <w:r>
-              <w:rPr>
-                <w:sz w:val="22"/>
-                <w:szCs w:val="22"/>
-              </w:rPr>
-              <w:t>/api/customer</w:t>
-            </w:r>
-            <w:r>
-              <w:rPr>
-                <w:sz w:val="22"/>
-                <w:szCs w:val="22"/>
-              </w:rPr>
-              <w:t>/update-customer/{customerId}</w:t>
-            </w:r>
-          </w:p>
-        </w:tc>
-        <w:tc>
-          <w:tcPr>
-            <w:tcW w:w="1313" w:type="dxa"/>
-          </w:tcPr>
-          <w:p>
-            <w:pPr>
-              <w:rPr>
-                <w:sz w:val="22"/>
-                <w:szCs w:val="22"/>
-              </w:rPr>
-            </w:pPr>
-            <w:r>
-              <w:rPr>
-                <w:sz w:val="22"/>
-                <w:szCs w:val="22"/>
-              </w:rPr>
-              <w:t>Update details of customer by their username</w:t>
-            </w:r>
-          </w:p>
-        </w:tc>
-        <w:tc>
-          <w:tcPr>
-            <w:tcW w:w="1127" w:type="dxa"/>
-          </w:tcPr>
-          <w:p>
-            <w:pPr>
-              <w:rPr>
-                <w:sz w:val="22"/>
-                <w:szCs w:val="22"/>
-              </w:rPr>
-            </w:pPr>
-            <w:r>
-              <w:rPr>
-                <w:sz w:val="22"/>
-                <w:szCs w:val="22"/>
-              </w:rPr>
-              <w:t>Customer</w:t>
-            </w:r>
-          </w:p>
-        </w:tc>
-      </w:tr>
-      <w:tr>
-        <w:tc>
-          <w:tcPr>
-            <w:tcW w:w="1422" w:type="dxa"/>
-          </w:tcPr>
-          <w:p>
-            <w:pPr>
-              <w:rPr>
-                <w:sz w:val="22"/>
-                <w:szCs w:val="22"/>
-              </w:rPr>
-            </w:pPr>
-            <w:r>
-              <w:rPr>
-                <w:sz w:val="22"/>
-                <w:szCs w:val="22"/>
-              </w:rPr>
-              <w:lastRenderedPageBreak/>
-              <w:t>Customer Controller</w:t>
-            </w:r>
-          </w:p>
-        </w:tc>
-        <w:tc>
-          <w:tcPr>
-            <w:tcW w:w="1090" w:type="dxa"/>
-          </w:tcPr>
-          <w:p>
-            <w:pPr>
-              <w:rPr>
-                <w:sz w:val="22"/>
-                <w:szCs w:val="22"/>
-              </w:rPr>
-            </w:pPr>
-            <w:r>
-              <w:rPr>
-                <w:sz w:val="22"/>
-                <w:szCs w:val="22"/>
-              </w:rPr>
-              <w:t>Rate provider</w:t>
-            </w:r>
-          </w:p>
-        </w:tc>
-        <w:tc>
-          <w:tcPr>
-            <w:tcW w:w="4069" w:type="dxa"/>
-          </w:tcPr>
-          <w:p>
-            <w:pPr>
-              <w:rPr>
-                <w:sz w:val="22"/>
-                <w:szCs w:val="22"/>
-              </w:rPr>
-            </w:pPr>
-            <w:r>
-              <w:rPr>
-                <w:sz w:val="22"/>
-                <w:szCs w:val="22"/>
-              </w:rPr>
-              <w:t xml:space="preserve">POST: </w:t>
-            </w:r>
-            <w:r>
-              <w:rPr>
-                <w:sz w:val="22"/>
-                <w:szCs w:val="22"/>
-              </w:rPr>
-              <w:t>/api/customer</w:t>
-            </w:r>
-            <w:r>
-              <w:rPr>
-                <w:sz w:val="22"/>
-                <w:szCs w:val="22"/>
-              </w:rPr>
-              <w:t>/rate-provider/{customerId}/{bookingId}/{ratingValue}</w:t>
-            </w:r>
-          </w:p>
-          <w:p>
-            <w:pPr>
-              <w:rPr>
-                <w:sz w:val="22"/>
-                <w:szCs w:val="22"/>
-              </w:rPr>
-            </w:pPr>
-          </w:p>
-        </w:tc>
-        <w:tc>
-          <w:tcPr>
-            <w:tcW w:w="1313" w:type="dxa"/>
-          </w:tcPr>
-          <w:p>
-            <w:pPr>
-              <w:rPr>
-                <w:sz w:val="22"/>
-                <w:szCs w:val="22"/>
-              </w:rPr>
-            </w:pPr>
-            <w:r>
-              <w:rPr>
-                <w:sz w:val="22"/>
-                <w:szCs w:val="22"/>
-              </w:rPr>
-              <w:t>Rate a provider based on booking</w:t>
-            </w:r>
-          </w:p>
-        </w:tc>
-        <w:tc>
-          <w:tcPr>
-            <w:tcW w:w="1127" w:type="dxa"/>
-          </w:tcPr>
-          <w:p>
-            <w:pPr>
-              <w:rPr>
-                <w:sz w:val="22"/>
-                <w:szCs w:val="22"/>
-              </w:rPr>
-            </w:pPr>
-            <w:r>
-              <w:rPr>
-                <w:sz w:val="22"/>
-                <w:szCs w:val="22"/>
-              </w:rPr>
-              <w:t>Customer</w:t>
-            </w:r>
-          </w:p>
-        </w:tc>
-      </w:tr>
-      <w:tr>
-        <w:tc>
-          <w:tcPr>
-            <w:tcW w:w="1422" w:type="dxa"/>
-          </w:tcPr>
-          <w:p>
-            <w:pPr>
-              <w:rPr>
-                <w:sz w:val="22"/>
-                <w:szCs w:val="22"/>
-              </w:rPr>
-            </w:pPr>
-            <w:r>
-              <w:rPr>
-                <w:sz w:val="22"/>
-                <w:szCs w:val="22"/>
-              </w:rPr>
-              <w:t>Customer Controller</w:t>
-            </w:r>
-          </w:p>
-        </w:tc>
-        <w:tc>
-          <w:tcPr>
-            <w:tcW w:w="1090" w:type="dxa"/>
-          </w:tcPr>
-          <w:p>
-            <w:pPr>
-              <w:rPr>
-                <w:sz w:val="22"/>
-                <w:szCs w:val="22"/>
-              </w:rPr>
-            </w:pPr>
-            <w:r>
-              <w:rPr>
-                <w:sz w:val="22"/>
-                <w:szCs w:val="22"/>
-              </w:rPr>
-              <w:t>See profile</w:t>
-            </w:r>
-          </w:p>
-        </w:tc>
-        <w:tc>
-          <w:tcPr>
-            <w:tcW w:w="4069" w:type="dxa"/>
-          </w:tcPr>
-          <w:p>
-            <w:pPr>
-              <w:rPr>
-                <w:sz w:val="22"/>
-                <w:szCs w:val="22"/>
-              </w:rPr>
-            </w:pPr>
-            <w:r>
-              <w:rPr>
-                <w:sz w:val="22"/>
-                <w:szCs w:val="22"/>
-              </w:rPr>
-              <w:t xml:space="preserve">GET: </w:t>
-            </w:r>
-            <w:r>
-              <w:rPr>
-                <w:sz w:val="22"/>
-                <w:szCs w:val="22"/>
-              </w:rPr>
-              <w:t>/api/customer</w:t>
-            </w:r>
-            <w:r>
-              <w:rPr>
-                <w:sz w:val="22"/>
-                <w:szCs w:val="22"/>
-              </w:rPr>
-              <w:t>/get-profile/{customerId}</w:t>
-            </w:r>
-          </w:p>
-        </w:tc>
-        <w:tc>
-          <w:tcPr>
-            <w:tcW w:w="1313" w:type="dxa"/>
-          </w:tcPr>
-          <w:p>
-            <w:pPr>
-              <w:rPr>
-                <w:sz w:val="22"/>
-                <w:szCs w:val="22"/>
-              </w:rPr>
-            </w:pPr>
-            <w:r>
-              <w:rPr>
-                <w:sz w:val="22"/>
-                <w:szCs w:val="22"/>
-              </w:rPr>
-              <w:t>See their profile details</w:t>
-            </w:r>
-          </w:p>
-        </w:tc>
-        <w:tc>
-          <w:tcPr>
-            <w:tcW w:w="1127" w:type="dxa"/>
-          </w:tcPr>
-          <w:p>
-            <w:pPr>
-              <w:rPr>
-                <w:sz w:val="22"/>
-                <w:szCs w:val="22"/>
-              </w:rPr>
-            </w:pPr>
-            <w:r>
-              <w:rPr>
-                <w:sz w:val="22"/>
-                <w:szCs w:val="22"/>
-              </w:rPr>
-              <w:t>Customer</w:t>
-            </w:r>
-          </w:p>
-        </w:tc>
-      </w:tr>
-      <w:tr>
-        <w:tc>
-          <w:tcPr>
-            <w:tcW w:w="1422" w:type="dxa"/>
-          </w:tcPr>
-          <w:p>
-            <w:pPr>
-              <w:rPr>
-                <w:sz w:val="22"/>
-                <w:szCs w:val="22"/>
-              </w:rPr>
-            </w:pPr>
-            <w:r>
-              <w:rPr>
-                <w:sz w:val="22"/>
-                <w:szCs w:val="22"/>
-              </w:rPr>
-              <w:t>Provider Controller</w:t>
-            </w:r>
-          </w:p>
-        </w:tc>
-        <w:tc>
-          <w:tcPr>
-            <w:tcW w:w="1090" w:type="dxa"/>
-          </w:tcPr>
-          <w:p>
-            <w:pPr>
-              <w:rPr>
-                <w:sz w:val="22"/>
-                <w:szCs w:val="22"/>
-              </w:rPr>
-            </w:pPr>
-            <w:r>
-              <w:rPr>
-                <w:sz w:val="22"/>
-                <w:szCs w:val="22"/>
-              </w:rPr>
-              <w:t>Update provider</w:t>
-            </w:r>
-          </w:p>
-        </w:tc>
-        <w:tc>
-          <w:tcPr>
-            <w:tcW w:w="4069" w:type="dxa"/>
-          </w:tcPr>
-          <w:p>
-            <w:pPr>
-              <w:rPr>
-                <w:sz w:val="22"/>
-                <w:szCs w:val="22"/>
-              </w:rPr>
-            </w:pPr>
-            <w:r>
-              <w:rPr>
-                <w:sz w:val="22"/>
-                <w:szCs w:val="22"/>
-              </w:rPr>
-              <w:t xml:space="preserve">PUT: </w:t>
-            </w:r>
-            <w:r>
-              <w:rPr>
-                <w:sz w:val="22"/>
-                <w:szCs w:val="22"/>
-              </w:rPr>
-              <w:t>/api/provider</w:t>
-            </w:r>
-            <w:r>
-              <w:rPr>
-                <w:sz w:val="22"/>
-                <w:szCs w:val="22"/>
-              </w:rPr>
-              <w:t>/update-provider/{providerId}</w:t>
-            </w:r>
-          </w:p>
-          <w:p>
-            <w:pPr>
-              <w:rPr>
-                <w:sz w:val="22"/>
-                <w:szCs w:val="22"/>
-              </w:rPr>
-            </w:pPr>
-          </w:p>
-        </w:tc>
-        <w:tc>
-          <w:tcPr>
-            <w:tcW w:w="1313" w:type="dxa"/>
-          </w:tcPr>
-          <w:p>
-            <w:pPr>
-              <w:rPr>
-                <w:sz w:val="22"/>
-                <w:szCs w:val="22"/>
-              </w:rPr>
-            </w:pPr>
-            <w:r>
-              <w:rPr>
-                <w:sz w:val="22"/>
-                <w:szCs w:val="22"/>
-              </w:rPr>
-              <w:t>Update details of</w:t>
-            </w:r>
-            <w:r>
-              <w:rPr>
-                <w:sz w:val="22"/>
-                <w:szCs w:val="22"/>
-              </w:rPr>
-              <w:t xml:space="preserve"> provider</w:t>
-            </w:r>
-            <w:r>
-              <w:rPr>
-                <w:sz w:val="22"/>
-                <w:szCs w:val="22"/>
-              </w:rPr>
-              <w:t xml:space="preserve"> by their username</w:t>
+              <w:t>Update details of provider by their username</w:t>
             </w:r>
           </w:p>
         </w:tc>
@@ -4365,7 +4527,10 @@
         <w:t xml:space="preserve">Total End Points: </w:t>
       </w:r>
       <w:r>
-        <w:t>38</w:t>
+        <w:t>3</w:t>
+      </w:r>
+      <w:r>
+        <w:t>9</w:t>
       </w:r>
     </w:p>
     <w:sectPr>

</xml_diff>

<commit_message>
API Calls docs. changed
</commit_message>
<xml_diff>
--- a/API Calls.docx
+++ b/API Calls.docx
@@ -1215,6 +1215,13 @@
               </w:rPr>
               <w:t>PUT: /api/admin/update-customer</w:t>
             </w:r>
+            <w:r>
+              <w:rPr>
+                <w:sz w:val="22"/>
+                <w:szCs w:val="22"/>
+              </w:rPr>
+              <w:t>/{customerId}</w:t>
+            </w:r>
           </w:p>
         </w:tc>
         <w:tc>
@@ -1745,6 +1752,13 @@
                 <w:szCs w:val="22"/>
               </w:rPr>
               <w:t>PUT: /api/admin/update-provider</w:t>
+            </w:r>
+            <w:r>
+              <w:rPr>
+                <w:sz w:val="22"/>
+                <w:szCs w:val="22"/>
+              </w:rPr>
+              <w:t>/{providerId}</w:t>
             </w:r>
           </w:p>
         </w:tc>
@@ -5146,6 +5160,7 @@
   <w:style w:type="character" w:default="1" w:styleId="DefaultParagraphFont">
     <w:name w:val="Default Paragraph Font"/>
     <w:uiPriority w:val="1"/>
+    <w:semiHidden/>
     <w:unhideWhenUsed/>
   </w:style>
   <w:style w:type="table" w:default="1" w:styleId="TableNormal">

</xml_diff>